<commit_message>
chore: freeze V1.1 baseline
</commit_message>
<xml_diff>
--- a/docs/01-product/Freight_Customer_Portal_PRD_V1.1_CN.docx
+++ b/docs/01-product/Freight_Customer_Portal_PRD_V1.1_CN.docx
@@ -6448,27 +6448,18 @@
         <w:shd w:fill="F4F7FA"/>
       </w:pPr>
       <w:r>
-        <w:t>CREATED</w:t>
+        <w:t>PLANNED / 待开船</w:t>
         <w:br/>
         <w:t>↓</w:t>
         <w:br/>
-        <w:t>BOOKED</w:t>
+        <w:t>DEPARTED / 运输中</w:t>
         <w:br/>
         <w:t>↓</w:t>
         <w:br/>
-        <w:t>DEPARTED</w:t>
+        <w:t>ARRIVED / 已到港</w:t>
         <w:br/>
-        <w:t>↓</w:t>
         <w:br/>
-        <w:t>IN_TRANSIT</w:t>
-        <w:br/>
-        <w:t>↓</w:t>
-        <w:br/>
-        <w:t>ARRIVED</w:t>
-        <w:br/>
-        <w:t>↓</w:t>
-        <w:br/>
-        <w:t>COMPLETED</w:t>
+        <w:t>另有：CANCELLED / 已取消</w:t>
       </w:r>
     </w:p>
     <w:p>

</xml_diff>